<commit_message>
Initial commit: estrutura base do simulador e tabelas sequenciais
</commit_message>
<xml_diff>
--- a/Trabalho Pratico CiberSeguranca.docx
+++ b/Trabalho Pratico CiberSeguranca.docx
@@ -24,11 +24,145 @@
       <w:r>
         <w:t>2026</w:t>
       </w:r>
-      <w:r>
+    </w:p>
+    <w:p/>
+    <w:p>
+      <w:pPr>
+        <w:rPr>
+          <w:lang w:val="en-US"/>
+        </w:rPr>
+      </w:pPr>
+      <w:r>
+        <w:rPr>
+          <w:lang w:val="en-US"/>
+        </w:rPr>
+        <w:t>cd "/</w:t>
+      </w:r>
+      <w:proofErr w:type="spellStart"/>
+      <w:r>
+        <w:rPr>
+          <w:lang w:val="en-US"/>
+        </w:rPr>
+        <w:t>mnt</w:t>
+      </w:r>
+      <w:proofErr w:type="spellEnd"/>
+      <w:r>
+        <w:rPr>
+          <w:lang w:val="en-US"/>
+        </w:rPr>
+        <w:t>/c/Users/</w:t>
+      </w:r>
+      <w:proofErr w:type="spellStart"/>
+      <w:r>
+        <w:rPr>
+          <w:lang w:val="en-US"/>
+        </w:rPr>
+        <w:t>MarcoSil</w:t>
+      </w:r>
+      <w:proofErr w:type="spellEnd"/>
+      <w:r>
+        <w:rPr>
+          <w:lang w:val="en-US"/>
+        </w:rPr>
+        <w:t xml:space="preserve">/OneDrive - </w:t>
+      </w:r>
+      <w:proofErr w:type="spellStart"/>
+      <w:r>
+        <w:rPr>
+          <w:lang w:val="en-US"/>
+        </w:rPr>
+        <w:t>QFree</w:t>
+      </w:r>
+      <w:proofErr w:type="spellEnd"/>
+      <w:r>
+        <w:rPr>
+          <w:lang w:val="en-US"/>
+        </w:rPr>
+        <w:t>/Documents/</w:t>
+      </w:r>
+      <w:proofErr w:type="spellStart"/>
+      <w:r>
+        <w:rPr>
+          <w:lang w:val="en-US"/>
+        </w:rPr>
+        <w:t>Estudo</w:t>
+      </w:r>
+      <w:proofErr w:type="spellEnd"/>
+      <w:r>
+        <w:rPr>
+          <w:lang w:val="en-US"/>
+        </w:rPr>
+        <w:t>/POS/</w:t>
+      </w:r>
+      <w:proofErr w:type="spellStart"/>
+      <w:r>
+        <w:rPr>
+          <w:lang w:val="en-US"/>
+        </w:rPr>
+        <w:t>DataAnalysis</w:t>
+      </w:r>
+      <w:proofErr w:type="spellEnd"/>
+      <w:r>
+        <w:rPr>
+          <w:lang w:val="en-US"/>
+        </w:rPr>
+        <w:t>"</w:t>
+      </w:r>
+      <w:r>
+        <w:rPr>
+          <w:lang w:val="en-US"/>
+        </w:rPr>
         <w:br/>
-      </w:r>
-      <w:r>
+        <w:t>source .</w:t>
+      </w:r>
+      <w:proofErr w:type="spellStart"/>
+      <w:r>
+        <w:rPr>
+          <w:lang w:val="en-US"/>
+        </w:rPr>
+        <w:t>venv</w:t>
+      </w:r>
+      <w:proofErr w:type="spellEnd"/>
+      <w:r>
+        <w:rPr>
+          <w:lang w:val="en-US"/>
+        </w:rPr>
+        <w:t>/bin/activate</w:t>
+      </w:r>
+      <w:r>
+        <w:rPr>
+          <w:lang w:val="en-US"/>
+        </w:rPr>
         <w:br/>
+      </w:r>
+      <w:r>
+        <w:rPr>
+          <w:lang w:val="en-US"/>
+        </w:rPr>
+        <w:br/>
+      </w:r>
+    </w:p>
+    <w:p>
+      <w:pPr>
+        <w:rPr>
+          <w:lang w:val="en-US"/>
+        </w:rPr>
+      </w:pPr>
+    </w:p>
+    <w:p>
+      <w:r>
+        <w:rPr>
+          <w:lang w:val="en-US"/>
+        </w:rPr>
+        <w:br/>
+      </w:r>
+      <w:r>
+        <w:rPr>
+          <w:lang w:val="en-US"/>
+        </w:rPr>
+        <w:br/>
+      </w:r>
+      <w:r>
         <w:t>Ferramentas Utilizadas:</w:t>
       </w:r>
       <w:r>
@@ -211,6 +345,7 @@
     </w:p>
     <w:p>
       <w:r>
+        <w:lastRenderedPageBreak/>
         <w:t xml:space="preserve">Para um projeto deste género (análise de performance de jogadores no Mundial), a melhor abordagem é dividir o desenvolvimento em </w:t>
       </w:r>
       <w:r>
@@ -496,6 +631,7 @@
           <w:b/>
           <w:bCs/>
         </w:rPr>
+        <w:lastRenderedPageBreak/>
         <w:t>Performance Global:</w:t>
       </w:r>
       <w:r>
@@ -614,188 +750,135 @@
         <w:t>$$\</w:t>
       </w:r>
       <w:proofErr w:type="spellStart"/>
-      <w:proofErr w:type="gramStart"/>
       <w:r>
         <w:t>text</w:t>
       </w:r>
       <w:proofErr w:type="spellEnd"/>
       <w:r>
-        <w:t>{</w:t>
-      </w:r>
-      <w:proofErr w:type="gramEnd"/>
-      <w:r>
-        <w:t>Pontuação} = (\</w:t>
-      </w:r>
-      <w:proofErr w:type="spellStart"/>
-      <w:proofErr w:type="gramStart"/>
+        <w:t>{Pontuação} = (\</w:t>
+      </w:r>
+      <w:proofErr w:type="spellStart"/>
       <w:r>
         <w:t>text</w:t>
       </w:r>
       <w:proofErr w:type="spellEnd"/>
       <w:r>
-        <w:t>{</w:t>
-      </w:r>
-      <w:proofErr w:type="gramEnd"/>
-      <w:r>
-        <w:t>Golos} \times 5) + (\</w:t>
-      </w:r>
-      <w:proofErr w:type="spellStart"/>
-      <w:proofErr w:type="gramStart"/>
+        <w:t>{Golos} \times 5) + (\</w:t>
+      </w:r>
+      <w:proofErr w:type="spellStart"/>
       <w:r>
         <w:t>text</w:t>
       </w:r>
       <w:proofErr w:type="spellEnd"/>
       <w:r>
-        <w:t>{</w:t>
-      </w:r>
-      <w:proofErr w:type="gramEnd"/>
-      <w:r>
-        <w:t>Assistências} \times 3) + (\</w:t>
-      </w:r>
-      <w:proofErr w:type="spellStart"/>
-      <w:proofErr w:type="gramStart"/>
+        <w:t>{Assistências} \times 3) + (\</w:t>
+      </w:r>
+      <w:proofErr w:type="spellStart"/>
       <w:r>
         <w:t>text</w:t>
       </w:r>
       <w:proofErr w:type="spellEnd"/>
       <w:r>
-        <w:t>{</w:t>
-      </w:r>
-      <w:proofErr w:type="gramEnd"/>
-      <w:r>
-        <w:t>Cortes} \times 1.5) + \</w:t>
-      </w:r>
-      <w:proofErr w:type="spellStart"/>
-      <w:proofErr w:type="gramStart"/>
+        <w:t>{Cortes} \times 1.5) + \</w:t>
+      </w:r>
+      <w:proofErr w:type="spellStart"/>
       <w:r>
         <w:t>left</w:t>
       </w:r>
       <w:proofErr w:type="spellEnd"/>
       <w:r>
-        <w:t>(</w:t>
-      </w:r>
-      <w:proofErr w:type="gramEnd"/>
-      <w:r>
-        <w:t>\</w:t>
-      </w:r>
-      <w:proofErr w:type="spellStart"/>
-      <w:proofErr w:type="gramStart"/>
+        <w:t>(\</w:t>
+      </w:r>
+      <w:proofErr w:type="spellStart"/>
       <w:r>
         <w:t>frac</w:t>
       </w:r>
       <w:proofErr w:type="spellEnd"/>
       <w:r>
-        <w:t>{</w:t>
-      </w:r>
-      <w:proofErr w:type="gramEnd"/>
-      <w:r>
-        <w:t>\</w:t>
-      </w:r>
-      <w:proofErr w:type="spellStart"/>
-      <w:proofErr w:type="gramStart"/>
+        <w:t>{\</w:t>
+      </w:r>
+      <w:proofErr w:type="spellStart"/>
       <w:r>
         <w:t>text</w:t>
       </w:r>
       <w:proofErr w:type="spellEnd"/>
       <w:r>
-        <w:t>{</w:t>
-      </w:r>
-      <w:proofErr w:type="gramEnd"/>
-      <w:r>
-        <w:t>Duelos Ganhos</w:t>
-      </w:r>
-      <w:proofErr w:type="gramStart"/>
-      <w:r>
-        <w:t>}}{</w:t>
-      </w:r>
-      <w:proofErr w:type="gramEnd"/>
-      <w:r>
-        <w:t>\</w:t>
-      </w:r>
-      <w:proofErr w:type="spellStart"/>
-      <w:proofErr w:type="gramStart"/>
+        <w:t>{Duelos Ganhos}}{\</w:t>
+      </w:r>
+      <w:proofErr w:type="spellStart"/>
       <w:r>
         <w:t>text</w:t>
       </w:r>
       <w:proofErr w:type="spellEnd"/>
       <w:r>
-        <w:t>{</w:t>
-      </w:r>
-      <w:proofErr w:type="gramEnd"/>
-      <w:r>
-        <w:t>Duelos Totais}} \times 2\</w:t>
-      </w:r>
-      <w:proofErr w:type="spellStart"/>
-      <w:proofErr w:type="gramStart"/>
+        <w:t>{Duelos Totais}} \times 2\</w:t>
+      </w:r>
+      <w:proofErr w:type="spellStart"/>
       <w:r>
         <w:t>right</w:t>
       </w:r>
       <w:proofErr w:type="spellEnd"/>
       <w:r>
-        <w:t>)$</w:t>
-      </w:r>
-      <w:proofErr w:type="gramEnd"/>
-      <w:r>
-        <w:t>$</w:t>
-      </w:r>
-    </w:p>
-    <w:p>
-      <w:pPr>
-        <w:rPr>
-          <w:b/>
-          <w:bCs/>
-        </w:rPr>
-      </w:pPr>
-      <w:r>
-        <w:rPr>
-          <w:b/>
-          <w:bCs/>
+        <w:t>)$$</w:t>
+      </w:r>
+    </w:p>
+    <w:p>
+      <w:pPr>
+        <w:rPr>
+          <w:b/>
+          <w:bCs/>
+        </w:rPr>
+      </w:pPr>
+      <w:r>
+        <w:rPr>
+          <w:b/>
+          <w:bCs/>
+        </w:rPr>
+        <w:t xml:space="preserve">3. Desenvolvendo o Core no </w:t>
+      </w:r>
+      <w:proofErr w:type="spellStart"/>
+      <w:r>
+        <w:rPr>
+          <w:b/>
+          <w:bCs/>
+        </w:rPr>
+        <w:t>Antigravity</w:t>
+      </w:r>
+      <w:proofErr w:type="spellEnd"/>
+      <w:r>
+        <w:rPr>
+          <w:b/>
+          <w:bCs/>
+        </w:rPr>
+        <w:t xml:space="preserve"> IDE</w:t>
+      </w:r>
+    </w:p>
+    <w:p>
+      <w:r>
+        <w:t xml:space="preserve">Podes começar por criar o motor de processamento. Aqui está um exemplo de como estruturar a classe principal em </w:t>
+      </w:r>
+      <w:proofErr w:type="spellStart"/>
+      <w:r>
+        <w:t>Python</w:t>
+      </w:r>
+      <w:proofErr w:type="spellEnd"/>
+      <w:r>
+        <w:t xml:space="preserve"> dentro do IDE para processar os jogadores e calcular a nota final com base nos teus requisitos:</w:t>
+      </w:r>
+    </w:p>
+    <w:p/>
+    <w:p>
+      <w:pPr>
+        <w:rPr>
+          <w:b/>
+          <w:bCs/>
+        </w:rPr>
+      </w:pPr>
+      <w:r>
+        <w:rPr>
+          <w:noProof/>
         </w:rPr>
         <w:lastRenderedPageBreak/>
-        <w:t xml:space="preserve">3. Desenvolvendo o Core no </w:t>
-      </w:r>
-      <w:proofErr w:type="spellStart"/>
-      <w:r>
-        <w:rPr>
-          <w:b/>
-          <w:bCs/>
-        </w:rPr>
-        <w:t>Antigravity</w:t>
-      </w:r>
-      <w:proofErr w:type="spellEnd"/>
-      <w:r>
-        <w:rPr>
-          <w:b/>
-          <w:bCs/>
-        </w:rPr>
-        <w:t xml:space="preserve"> IDE</w:t>
-      </w:r>
-    </w:p>
-    <w:p>
-      <w:r>
-        <w:t xml:space="preserve">Podes começar por criar o motor de processamento. Aqui está um exemplo de como estruturar a classe principal em </w:t>
-      </w:r>
-      <w:proofErr w:type="spellStart"/>
-      <w:r>
-        <w:t>Python</w:t>
-      </w:r>
-      <w:proofErr w:type="spellEnd"/>
-      <w:r>
-        <w:t xml:space="preserve"> dentro do IDE para processar os jogadores e calcular a nota final com base nos teus requisitos:</w:t>
-      </w:r>
-    </w:p>
-    <w:p/>
-    <w:p>
-      <w:pPr>
-        <w:rPr>
-          <w:b/>
-          <w:bCs/>
-        </w:rPr>
-      </w:pPr>
-      <w:r>
-        <w:rPr>
-          <w:noProof/>
-        </w:rPr>
         <w:drawing>
           <wp:inline distT="0" distB="0" distL="0" distR="0" wp14:anchorId="32DE40E1" wp14:editId="0846418E">
             <wp:extent cx="5943600" cy="5676265"/>
@@ -871,7 +954,6 @@
           <w:b/>
           <w:bCs/>
         </w:rPr>
-        <w:lastRenderedPageBreak/>
         <w:t>Criar a Base de Dados Fictícia (</w:t>
       </w:r>
       <w:proofErr w:type="spellStart"/>
@@ -924,6 +1006,7 @@
           <w:b/>
           <w:bCs/>
         </w:rPr>
+        <w:lastRenderedPageBreak/>
         <w:t>Refinar as Fórmulas Estatísticas:</w:t>
       </w:r>
       <w:r>
@@ -946,30 +1029,16 @@
     <w:p/>
     <w:p>
       <w:r>
-        <w:t xml:space="preserve">O ficheiro </w:t>
-      </w:r>
-      <w:proofErr w:type="gramStart"/>
-      <w:r>
-        <w:t>terá  o</w:t>
-      </w:r>
-      <w:proofErr w:type="gramEnd"/>
-      <w:r>
-        <w:t xml:space="preserve"> nome de </w:t>
-      </w:r>
-      <w:proofErr w:type="spellStart"/>
-      <w:r>
-        <w:t>dados_</w:t>
-      </w:r>
-      <w:proofErr w:type="gramStart"/>
-      <w:r>
-        <w:t>mundial.json</w:t>
-      </w:r>
-      <w:proofErr w:type="spellEnd"/>
-      <w:proofErr w:type="gramEnd"/>
-    </w:p>
-    <w:p>
-      <w:r>
-        <w:lastRenderedPageBreak/>
+        <w:t xml:space="preserve">O ficheiro terá  o nome de </w:t>
+      </w:r>
+      <w:proofErr w:type="spellStart"/>
+      <w:r>
+        <w:t>dados_mundial.json</w:t>
+      </w:r>
+      <w:proofErr w:type="spellEnd"/>
+    </w:p>
+    <w:p>
+      <w:r>
         <w:t xml:space="preserve">Trecho do </w:t>
       </w:r>
       <w:proofErr w:type="spellStart"/>
@@ -1146,7 +1215,6 @@
         </w:rPr>
       </w:pPr>
       <w:r>
-        <w:lastRenderedPageBreak/>
         <w:br/>
       </w:r>
     </w:p>
@@ -1214,13 +1282,8 @@
       </w:r>
     </w:p>
     <w:p>
-      <w:proofErr w:type="gramStart"/>
-      <w:r>
-        <w:t>Cria um novo</w:t>
-      </w:r>
-      <w:proofErr w:type="gramEnd"/>
-      <w:r>
-        <w:t xml:space="preserve"> ficheiro chamado stats.py dentro da tua pasta </w:t>
+      <w:r>
+        <w:t xml:space="preserve">Cria um novo ficheiro chamado stats.py dentro da tua pasta </w:t>
       </w:r>
       <w:proofErr w:type="spellStart"/>
       <w:r>
@@ -1305,13 +1368,8 @@
       </w:r>
     </w:p>
     <w:p>
-      <w:proofErr w:type="gramStart"/>
-      <w:r>
-        <w:t>Cria um novo</w:t>
-      </w:r>
-      <w:proofErr w:type="gramEnd"/>
-      <w:r>
-        <w:t xml:space="preserve"> ficheiro chamado dashboard.py no teu </w:t>
+      <w:r>
+        <w:t xml:space="preserve">Cria um novo ficheiro chamado dashboard.py no teu </w:t>
       </w:r>
       <w:proofErr w:type="spellStart"/>
       <w:r>
@@ -1495,7 +1553,6 @@
               <w:t xml:space="preserve">python3 -m </w:t>
             </w:r>
             <w:proofErr w:type="spellStart"/>
-            <w:proofErr w:type="gramStart"/>
             <w:r>
               <w:rPr>
                 <w:lang w:val="en-US"/>
@@ -1517,14 +1574,12 @@
               <w:t>venv</w:t>
             </w:r>
             <w:proofErr w:type="spellEnd"/>
-            <w:proofErr w:type="gramEnd"/>
             <w:r>
               <w:rPr>
                 <w:lang w:val="en-US"/>
               </w:rPr>
               <w:br/>
             </w:r>
-            <w:proofErr w:type="gramStart"/>
             <w:r>
               <w:rPr>
                 <w:lang w:val="en-US"/>
@@ -1539,7 +1594,6 @@
               <w:t>venv</w:t>
             </w:r>
             <w:proofErr w:type="spellEnd"/>
-            <w:proofErr w:type="gramEnd"/>
             <w:r>
               <w:rPr>
                 <w:lang w:val="en-US"/>
@@ -1596,6 +1650,7 @@
               <w:rPr>
                 <w:lang w:val="en-US"/>
               </w:rPr>
+              <w:lastRenderedPageBreak/>
               <w:t>#</w:t>
             </w:r>
             <w:r>
@@ -1625,7 +1680,6 @@
               <w:t xml:space="preserve"> run dashboard.py --</w:t>
             </w:r>
             <w:proofErr w:type="spellStart"/>
-            <w:proofErr w:type="gramStart"/>
             <w:r>
               <w:rPr>
                 <w:lang w:val="en-US"/>
@@ -1633,7 +1687,6 @@
               <w:t>server.headless</w:t>
             </w:r>
             <w:proofErr w:type="spellEnd"/>
-            <w:proofErr w:type="gramEnd"/>
             <w:r>
               <w:rPr>
                 <w:lang w:val="en-US"/>
@@ -1641,7 +1694,6 @@
               <w:t xml:space="preserve"> true --</w:t>
             </w:r>
             <w:proofErr w:type="spellStart"/>
-            <w:proofErr w:type="gramStart"/>
             <w:r>
               <w:rPr>
                 <w:lang w:val="en-US"/>
@@ -1649,7 +1701,6 @@
               <w:t>server.enableCORS</w:t>
             </w:r>
             <w:proofErr w:type="spellEnd"/>
-            <w:proofErr w:type="gramEnd"/>
             <w:r>
               <w:rPr>
                 <w:lang w:val="en-US"/>
@@ -1668,7 +1719,6 @@
       </w:pPr>
     </w:p>
     <w:p>
-      <w:proofErr w:type="gramStart"/>
       <w:r>
         <w:rPr>
           <w:lang w:val="en-US"/>
@@ -1683,40 +1733,25 @@
           <w:b/>
           <w:bCs/>
         </w:rPr>
-        <w:t>Evolução</w:t>
-      </w:r>
-      <w:proofErr w:type="gramEnd"/>
-      <w:r>
-        <w:rPr>
-          <w:b/>
-          <w:bCs/>
-        </w:rPr>
-        <w:t xml:space="preserve"> do Modelo de Dados:</w:t>
+        <w:t>Evolução do Modelo de Dados:</w:t>
       </w:r>
       <w:r>
         <w:t xml:space="preserve"> Podemos adicionar mais um ou dois jogos ao teu ficheiro </w:t>
       </w:r>
       <w:proofErr w:type="spellStart"/>
       <w:r>
-        <w:t>dados_</w:t>
-      </w:r>
-      <w:proofErr w:type="gramStart"/>
-      <w:r>
-        <w:t>mundial.json</w:t>
-      </w:r>
-      <w:proofErr w:type="spellEnd"/>
-      <w:proofErr w:type="gramEnd"/>
+        <w:t>dados_mundial.json</w:t>
+      </w:r>
+      <w:proofErr w:type="spellEnd"/>
       <w:r>
         <w:t xml:space="preserve"> para testar como o código se comporta quando calcula médias ou acumula pontos de várias jornadas.</w:t>
       </w:r>
     </w:p>
     <w:p>
-      <w:proofErr w:type="gramStart"/>
       <w:r>
         <w:rPr>
           <w:lang w:val="en-US"/>
         </w:rPr>
-        <w:lastRenderedPageBreak/>
         <w:t></w:t>
       </w:r>
       <w:r>
@@ -1727,15 +1762,7 @@
           <w:b/>
           <w:bCs/>
         </w:rPr>
-        <w:t>Novas</w:t>
-      </w:r>
-      <w:proofErr w:type="gramEnd"/>
-      <w:r>
-        <w:rPr>
-          <w:b/>
-          <w:bCs/>
-        </w:rPr>
-        <w:t xml:space="preserve"> Funcionalidades no </w:t>
+        <w:t xml:space="preserve">Novas Funcionalidades no </w:t>
       </w:r>
       <w:proofErr w:type="spellStart"/>
       <w:r>
@@ -1766,7 +1793,6 @@
       </w:r>
     </w:p>
     <w:p>
-      <w:proofErr w:type="gramStart"/>
       <w:r>
         <w:rPr>
           <w:lang w:val="en-US"/>
@@ -1781,15 +1807,7 @@
           <w:b/>
           <w:bCs/>
         </w:rPr>
-        <w:t>Refinamento</w:t>
-      </w:r>
-      <w:proofErr w:type="gramEnd"/>
-      <w:r>
-        <w:rPr>
-          <w:b/>
-          <w:bCs/>
-        </w:rPr>
-        <w:t xml:space="preserve"> de Pesos:</w:t>
+        <w:t>Refinamento de Pesos:</w:t>
       </w:r>
       <w:r>
         <w:t xml:space="preserve"> Se achares que as notas finais estão demasiado altas ou baixas para alguma das posições, podemos afinar as fórmulas matemáticas no stats.py.</w:t>
@@ -1813,14 +1831,9 @@
       </w:r>
       <w:proofErr w:type="spellStart"/>
       <w:r>
-        <w:t>dados_</w:t>
-      </w:r>
-      <w:proofErr w:type="gramStart"/>
-      <w:r>
-        <w:t>mundial.json</w:t>
-      </w:r>
-      <w:proofErr w:type="spellEnd"/>
-      <w:proofErr w:type="gramEnd"/>
+        <w:t>dados_mundial.json</w:t>
+      </w:r>
+      <w:proofErr w:type="spellEnd"/>
       <w:r>
         <w:t xml:space="preserve"> do zero, </w:t>
       </w:r>

</xml_diff>